<commit_message>
Resumes: AI-assisted rebuild, agentic-coding projects, .NET 10; drop absolute claims
</commit_message>
<xml_diff>
--- a/resume_en.docx
+++ b/resume_en.docx
@@ -220,7 +220,7 @@
                 <w:color w:val="2D3748"/>
                 <w:sz w:val="18"/>
               </w:rPr>
-              <w:t>•  Concurrency control on balance mutation, eliminating a race condition that duplicated funds in early staging.</w:t>
+              <w:t>•  Concurrency control on balance mutation, added after a race condition duplicated funds in early staging.</w:t>
             </w:r>
           </w:p>
           <w:p>
@@ -458,6 +458,22 @@
                 <w:color w:val="2D3748"/>
                 <w:sz w:val="18"/>
               </w:rPr>
+              <w:t>•  Rebuilt onto .NET 8 with AI-assisted development, then migrated to .NET 10; day-to-day operations run with Claude.</w:t>
+            </w:r>
+          </w:p>
+          <w:p>
+            <w:pPr>
+              <w:spacing w:after="40"/>
+              <w:ind w:left="200"/>
+              <w:jc w:val="left"/>
+            </w:pPr>
+            <w:r>
+              <w:rPr>
+                <w:rFonts w:ascii="Arial" w:hAnsi="Arial"/>
+                <w:b w:val="0"/>
+                <w:color w:val="2D3748"/>
+                <w:sz w:val="18"/>
+              </w:rPr>
               <w:t>•  Nine years of maintenance taught me more about long-lived systems than any zero-to-one project.</w:t>
             </w:r>
           </w:p>
@@ -599,6 +615,86 @@
                 <w:sz w:val="18"/>
               </w:rPr>
               <w:t>•  Delivered the full slice — API, data access, UI (Kendo UI) and reporting (Stimulsoft) — rather than a single layer.</w:t>
+            </w:r>
+          </w:p>
+          <w:p>
+            <w:pPr>
+              <w:spacing w:before="240" w:after="80"/>
+              <w:jc w:val="left"/>
+              <w:pBdr>
+                <w:bottom w:val="single" w:sz="6" w:space="2" w:color="1A365D"/>
+              </w:pBdr>
+            </w:pPr>
+            <w:r>
+              <w:rPr>
+                <w:rFonts w:ascii="Arial" w:hAnsi="Arial"/>
+                <w:b/>
+                <w:color w:val="1A365D"/>
+                <w:sz w:val="22"/>
+              </w:rPr>
+              <w:t>SELECTED PROJECTS (AGENTIC CODING)</w:t>
+            </w:r>
+          </w:p>
+          <w:p>
+            <w:pPr>
+              <w:spacing w:before="160" w:after="40"/>
+              <w:jc w:val="left"/>
+            </w:pPr>
+            <w:r>
+              <w:rPr>
+                <w:rFonts w:ascii="Arial" w:hAnsi="Arial"/>
+                <w:b/>
+                <w:color w:val="1A365D"/>
+                <w:sz w:val="21"/>
+              </w:rPr>
+              <w:t>Mahshahr Adventure: bicycle-shop website (client project)</w:t>
+            </w:r>
+          </w:p>
+          <w:p>
+            <w:pPr>
+              <w:spacing w:after="40"/>
+              <w:ind w:left="200"/>
+              <w:jc w:val="left"/>
+            </w:pPr>
+            <w:r>
+              <w:rPr>
+                <w:rFonts w:ascii="Arial" w:hAnsi="Arial"/>
+                <w:b w:val="0"/>
+                <w:color w:val="2D3748"/>
+                <w:sz w:val="18"/>
+              </w:rPr>
+              <w:t>•  Online store, trip and camping sign-ups, repair requests with tracking. Built 100% with vibe coding (Claude Code, Cursor) on .NET 10.</w:t>
+            </w:r>
+          </w:p>
+          <w:p>
+            <w:pPr>
+              <w:spacing w:before="160" w:after="40"/>
+              <w:jc w:val="left"/>
+            </w:pPr>
+            <w:r>
+              <w:rPr>
+                <w:rFonts w:ascii="Arial" w:hAnsi="Arial"/>
+                <w:b/>
+                <w:color w:val="1A365D"/>
+                <w:sz w:val="21"/>
+              </w:rPr>
+              <w:t>LifeBudget: web + Android budgeting app (personal project)</w:t>
+            </w:r>
+          </w:p>
+          <w:p>
+            <w:pPr>
+              <w:spacing w:after="40"/>
+              <w:ind w:left="200"/>
+              <w:jc w:val="left"/>
+            </w:pPr>
+            <w:r>
+              <w:rPr>
+                <w:rFonts w:ascii="Arial" w:hAnsi="Arial"/>
+                <w:b w:val="0"/>
+                <w:color w:val="2D3748"/>
+                <w:sz w:val="18"/>
+              </w:rPr>
+              <w:t>•  Logs spending from bank SMS and tracks instalment credit; no foreign dependencies. ASP.NET Core, Kotlin.</w:t>
             </w:r>
           </w:p>
         </w:tc>
@@ -809,7 +905,7 @@
                 <w:color w:val="2D3748"/>
                 <w:sz w:val="17"/>
               </w:rPr>
-              <w:t>C#, .NET 8, ASP.NET Core, ASP.NET MVC, Blazor, React</w:t>
+              <w:t>C#, .NET 10, ASP.NET Core, ASP.NET MVC, Blazor, React</w:t>
             </w:r>
           </w:p>
           <w:p>
@@ -900,6 +996,36 @@
                 <w:sz w:val="17"/>
               </w:rPr>
               <w:t>RabbitMQ, Docker, Serilog + ELK, Grafana, Git, Azure DevOps / TFS, IIS</w:t>
+            </w:r>
+          </w:p>
+          <w:p>
+            <w:pPr>
+              <w:spacing w:before="80" w:after="40"/>
+              <w:jc w:val="left"/>
+            </w:pPr>
+            <w:r>
+              <w:rPr>
+                <w:rFonts w:ascii="Arial" w:hAnsi="Arial"/>
+                <w:b/>
+                <w:color w:val="1A365D"/>
+                <w:sz w:val="18"/>
+              </w:rPr>
+              <w:t>AI-assisted development:</w:t>
+            </w:r>
+          </w:p>
+          <w:p>
+            <w:pPr>
+              <w:spacing w:after="80"/>
+              <w:jc w:val="left"/>
+            </w:pPr>
+            <w:r>
+              <w:rPr>
+                <w:rFonts w:ascii="Arial" w:hAnsi="Arial"/>
+                <w:b w:val="0"/>
+                <w:color w:val="2D3748"/>
+                <w:sz w:val="17"/>
+              </w:rPr>
+              <w:t>Claude Code, Cursor, GitHub Copilot</w:t>
             </w:r>
           </w:p>
           <w:p>

</xml_diff>

<commit_message>
Resumes: general backend positioning
</commit_message>
<xml_diff>
--- a/resume_en.docx
+++ b/resume_en.docx
@@ -59,7 +59,7 @@
                 <w:color w:val="718096"/>
                 <w:sz w:val="20"/>
               </w:rPr>
-              <w:t>Senior .NET Backend Engineer  |  Wallets, Ledgers &amp; Insurance Core Systems</w:t>
+              <w:t>Backend Engineer  |  C# · .NET 10 · DDD · CQRS · TDD  |  Agentic / AI-assisted coding</w:t>
             </w:r>
           </w:p>
           <w:p>
@@ -92,7 +92,7 @@
                 <w:color w:val="2D3748"/>
                 <w:sz w:val="19"/>
               </w:rPr>
-              <w:t>I work on systems where mistakes are expensive. Seven years on wallets, ledgers and insurance platforms where a rounding error is a real person's real money. As the sole developer, I took a digital wallet from a half-finished codebase to production, where it processed 200+ billion Toman in roughly two years. I work with Clean Architecture, DDD and CQRS because in practice they keep the cost of change low.</w:t>
+              <w:t>Backend engineer building with .NET since 2017. I like owning a system end to end: architecture, data, integrations, deployment and monitoring. As the sole developer I took a high-volume transaction system from a half-finished codebase to production, where it processed 200+ billion Toman in about two years. I work with Clean Architecture, DDD and CQRS, and I ship faster with agentic coding (Claude Code) while keeping architecture, review and production in my own hands.</w:t>
             </w:r>
           </w:p>
           <w:p>
@@ -156,7 +156,7 @@
                 <w:color w:val="2D3748"/>
                 <w:sz w:val="18"/>
               </w:rPr>
-              <w:t>•  Sole owner of the company's digital wallet — 200+ billion Toman processed in ~2 years.</w:t>
+              <w:t>•  Sole developer of a high-volume transaction system: 200+ billion Toman processed in ~2 years.</w:t>
             </w:r>
           </w:p>
           <w:p>
@@ -172,7 +172,7 @@
                 <w:color w:val="2D3748"/>
                 <w:sz w:val="18"/>
               </w:rPr>
-              <w:t>•  Ledger as the single source of truth — every balance a user sees is reconstructable from recorded transactions, not from a cached column.</w:t>
+              <w:t>•  Append-only transaction log as the single source of truth — every derived value is reconstructable from recorded transactions, not from a cached column.</w:t>
             </w:r>
           </w:p>
           <w:p>
@@ -188,7 +188,7 @@
                 <w:color w:val="2D3748"/>
                 <w:sz w:val="18"/>
               </w:rPr>
-              <w:t>•  Money as a value object (amount + currency + rules) instead of a bare decimal, so cross-currency and negative-amount errors fail loudly at the domain boundary.</w:t>
+              <w:t>•  Value objects instead of primitives, so invalid operations fail loudly at the domain boundary instead of silently in a report.</w:t>
             </w:r>
           </w:p>
           <w:p>
@@ -204,7 +204,7 @@
                 <w:color w:val="2D3748"/>
                 <w:sz w:val="18"/>
               </w:rPr>
-              <w:t>•  Idempotency across payment-gateway callbacks and user retries — duplicate callbacks and double-clicks no longer create duplicate money.</w:t>
+              <w:t>•  Idempotent handling of third-party callbacks and client retries — duplicate requests have no side effects.</w:t>
             </w:r>
           </w:p>
           <w:p>
@@ -220,7 +220,7 @@
                 <w:color w:val="2D3748"/>
                 <w:sz w:val="18"/>
               </w:rPr>
-              <w:t>•  Concurrency control on balance mutation, added after a race condition duplicated funds in early staging.</w:t>
+              <w:t>•  Concurrency control on hot rows, added after a race condition surfaced in early staging.</w:t>
             </w:r>
           </w:p>
           <w:p>
@@ -236,7 +236,7 @@
                 <w:color w:val="2D3748"/>
                 <w:sz w:val="18"/>
               </w:rPr>
-              <w:t>•  Automated nightly reconciliation, written after one manual mismatch investigation cost three days.</w:t>
+              <w:t>•  Automated nightly consistency checks, written after one manual investigation took three days.</w:t>
             </w:r>
           </w:p>
           <w:p>
@@ -252,7 +252,7 @@
                 <w:color w:val="2D3748"/>
                 <w:sz w:val="18"/>
               </w:rPr>
-              <w:t>•  Structured logging with Serilog + ELK; transaction monitoring dashboard for the operations team.</w:t>
+              <w:t>•  Structured logging with Serilog + ELK; monitoring dashboard for the operations team.</w:t>
             </w:r>
           </w:p>
           <w:p>
@@ -268,7 +268,7 @@
                 <w:color w:val="2D3748"/>
                 <w:sz w:val="18"/>
               </w:rPr>
-              <w:t>•  Pattern-based detection for abnormal transaction bursts.</w:t>
+              <w:t>•  Pattern-based detection of abnormal traffic bursts.</w:t>
             </w:r>
           </w:p>
           <w:p>
@@ -284,7 +284,7 @@
                 <w:color w:val="2D3748"/>
                 <w:sz w:val="18"/>
               </w:rPr>
-              <w:t>•  Two wallet types (credit and cash) with independent business rules; gateway deposits, referral credit, withdrawal, P2P transfer.</w:t>
+              <w:t>•  Third-party integrations built as separate services with explicit failure paths.</w:t>
             </w:r>
           </w:p>
           <w:p>
@@ -300,23 +300,7 @@
                 <w:color w:val="2D3748"/>
                 <w:sz w:val="18"/>
               </w:rPr>
-              <w:t>•  Payment-gateway integration built as a separate service with explicit failure paths.</w:t>
-            </w:r>
-          </w:p>
-          <w:p>
-            <w:pPr>
-              <w:spacing w:after="40"/>
-              <w:ind w:left="200"/>
-              <w:jc w:val="left"/>
-            </w:pPr>
-            <w:r>
-              <w:rPr>
-                <w:rFonts w:ascii="Arial" w:hAnsi="Arial"/>
-                <w:b w:val="0"/>
-                <w:color w:val="2D3748"/>
-                <w:sz w:val="18"/>
-              </w:rPr>
-              <w:t>•  Absorbed 10x growth in transaction volume via query tuning, Redis caching and background jobs.</w:t>
+              <w:t>•  Absorbed 10x growth in volume via query tuning, Redis caching and background jobs.</w:t>
             </w:r>
           </w:p>
           <w:p>
@@ -348,7 +332,7 @@
                 <w:color w:val="2D3748"/>
                 <w:sz w:val="18"/>
               </w:rPr>
-              <w:t>•  Gold Unit-Link — event-driven microservices (.NET 6, DDD).</w:t>
+              <w:t>•  Event-driven microservices (.NET 6, DDD): development and maintenance.</w:t>
             </w:r>
           </w:p>
           <w:p>
@@ -364,7 +348,7 @@
                 <w:color w:val="2D3748"/>
                 <w:sz w:val="18"/>
               </w:rPr>
-              <w:t>•  Darmanat — ASP.NET MVC / ADO.NET: new features, custom metrics, Grafana dashboards.</w:t>
+              <w:t>•  Legacy ASP.NET MVC / ADO.NET system: new features, custom metrics, Grafana dashboards.</w:t>
             </w:r>
           </w:p>
           <w:p>
@@ -520,7 +504,7 @@
                 <w:color w:val="2D3748"/>
                 <w:sz w:val="18"/>
               </w:rPr>
-              <w:t>•  Built and debugged core banking modules with a DDD-layered structure, keeping business rules out of controllers and infrastructure.</w:t>
+              <w:t>•  Built and debugged core business modules with a DDD-layered structure, keeping business rules out of controllers and infrastructure.</w:t>
             </w:r>
           </w:p>
           <w:p>
@@ -552,7 +536,7 @@
                 <w:color w:val="2D3748"/>
                 <w:sz w:val="18"/>
               </w:rPr>
-              <w:t>•  Integrated external banking services via Flurl, with retry and failure handling around calls we did not control.</w:t>
+              <w:t>•  Integrated external services via Flurl, with retry and failure handling around calls we did not control.</w:t>
             </w:r>
           </w:p>
           <w:p>
@@ -632,38 +616,7 @@
                 <w:color w:val="1A365D"/>
                 <w:sz w:val="22"/>
               </w:rPr>
-              <w:t>SELECTED PROJECTS (AGENTIC CODING)</w:t>
-            </w:r>
-          </w:p>
-          <w:p>
-            <w:pPr>
-              <w:spacing w:before="160" w:after="40"/>
-              <w:jc w:val="left"/>
-            </w:pPr>
-            <w:r>
-              <w:rPr>
-                <w:rFonts w:ascii="Arial" w:hAnsi="Arial"/>
-                <w:b/>
-                <w:color w:val="1A365D"/>
-                <w:sz w:val="21"/>
-              </w:rPr>
-              <w:t>Mahshahr Adventure: bicycle-shop website (client project)</w:t>
-            </w:r>
-          </w:p>
-          <w:p>
-            <w:pPr>
-              <w:spacing w:after="40"/>
-              <w:ind w:left="200"/>
-              <w:jc w:val="left"/>
-            </w:pPr>
-            <w:r>
-              <w:rPr>
-                <w:rFonts w:ascii="Arial" w:hAnsi="Arial"/>
-                <w:b w:val="0"/>
-                <w:color w:val="2D3748"/>
-                <w:sz w:val="18"/>
-              </w:rPr>
-              <w:t>•  Online store, trip and camping sign-ups, repair requests with tracking. Built 100% with vibe coding (Claude Code, Cursor) on .NET 10.</w:t>
+              <w:t>SELECTED PROJECT (AGENTIC CODING)</w:t>
             </w:r>
           </w:p>
           <w:p>
@@ -1040,7 +993,7 @@
                 <w:color w:val="1A365D"/>
                 <w:sz w:val="18"/>
               </w:rPr>
-              <w:t>Domain:</w:t>
+              <w:t>Practices:</w:t>
             </w:r>
           </w:p>
           <w:p>
@@ -1055,7 +1008,7 @@
                 <w:color w:val="2D3748"/>
                 <w:sz w:val="17"/>
               </w:rPr>
-              <w:t>Ledger design, reconciliation, idempotency, payment-gateway integration, insurance issuance</w:t>
+              <w:t>Idempotency, concurrency control, consistency checks, observability, third-party integrations</w:t>
             </w:r>
           </w:p>
           <w:p>

</xml_diff>

<commit_message>
Restore wallet details in experience; education without campus
</commit_message>
<xml_diff>
--- a/resume_en.docx
+++ b/resume_en.docx
@@ -156,7 +156,7 @@
                 <w:color w:val="2D3748"/>
                 <w:sz w:val="18"/>
               </w:rPr>
-              <w:t>•  Sole developer of a high-volume transaction system: 200+ billion Toman processed in ~2 years.</w:t>
+              <w:t>•  Sole developer of the company's digital wallet: 200+ billion Toman processed in ~2 years.</w:t>
             </w:r>
           </w:p>
           <w:p>
@@ -172,7 +172,7 @@
                 <w:color w:val="2D3748"/>
                 <w:sz w:val="18"/>
               </w:rPr>
-              <w:t>•  Append-only transaction log as the single source of truth — every derived value is reconstructable from recorded transactions, not from a cached column.</w:t>
+              <w:t>•  Ledger as the single source of truth — every balance a user sees is reconstructable from recorded transactions, not from a cached column.</w:t>
             </w:r>
           </w:p>
           <w:p>
@@ -188,7 +188,7 @@
                 <w:color w:val="2D3748"/>
                 <w:sz w:val="18"/>
               </w:rPr>
-              <w:t>•  Value objects instead of primitives, so invalid operations fail loudly at the domain boundary instead of silently in a report.</w:t>
+              <w:t>•  Money as a value object (amount + currency + rules) instead of a bare decimal, so cross-currency and negative-amount errors fail loudly at the domain boundary.</w:t>
             </w:r>
           </w:p>
           <w:p>
@@ -204,7 +204,7 @@
                 <w:color w:val="2D3748"/>
                 <w:sz w:val="18"/>
               </w:rPr>
-              <w:t>•  Idempotent handling of third-party callbacks and client retries — duplicate requests have no side effects.</w:t>
+              <w:t>•  Idempotency across payment-gateway callbacks and user retries — duplicate callbacks and double-clicks do not create duplicate money.</w:t>
             </w:r>
           </w:p>
           <w:p>
@@ -220,7 +220,7 @@
                 <w:color w:val="2D3748"/>
                 <w:sz w:val="18"/>
               </w:rPr>
-              <w:t>•  Concurrency control on hot rows, added after a race condition surfaced in early staging.</w:t>
+              <w:t>•  Concurrency control on balance mutation, added after a race condition duplicated funds in early staging.</w:t>
             </w:r>
           </w:p>
           <w:p>
@@ -236,7 +236,7 @@
                 <w:color w:val="2D3748"/>
                 <w:sz w:val="18"/>
               </w:rPr>
-              <w:t>•  Automated nightly consistency checks, written after one manual investigation took three days.</w:t>
+              <w:t>•  Automated nightly reconciliation, written after one manual mismatch investigation took three days.</w:t>
             </w:r>
           </w:p>
           <w:p>
@@ -268,7 +268,7 @@
                 <w:color w:val="2D3748"/>
                 <w:sz w:val="18"/>
               </w:rPr>
-              <w:t>•  Pattern-based detection of abnormal traffic bursts.</w:t>
+              <w:t>•  Pattern-based detection of abnormal transaction bursts.</w:t>
             </w:r>
           </w:p>
           <w:p>
@@ -284,7 +284,7 @@
                 <w:color w:val="2D3748"/>
                 <w:sz w:val="18"/>
               </w:rPr>
-              <w:t>•  Third-party integrations built as separate services with explicit failure paths.</w:t>
+              <w:t>•  Two wallet types (credit and cash); payment-gateway integration built as a separate service with explicit failure paths.</w:t>
             </w:r>
           </w:p>
           <w:p>
@@ -300,7 +300,7 @@
                 <w:color w:val="2D3748"/>
                 <w:sz w:val="18"/>
               </w:rPr>
-              <w:t>•  Absorbed 10x growth in volume via query tuning, Redis caching and background jobs.</w:t>
+              <w:t>•  Absorbed 10x growth in transaction volume via query tuning, Redis caching and background jobs.</w:t>
             </w:r>
           </w:p>
           <w:p>
@@ -504,7 +504,7 @@
                 <w:color w:val="2D3748"/>
                 <w:sz w:val="18"/>
               </w:rPr>
-              <w:t>•  Built and debugged core business modules with a DDD-layered structure, keeping business rules out of controllers and infrastructure.</w:t>
+              <w:t>•  Built and debugged core banking modules with a DDD-layered structure, keeping business rules out of controllers and infrastructure.</w:t>
             </w:r>
           </w:p>
           <w:p>
@@ -536,7 +536,7 @@
                 <w:color w:val="2D3748"/>
                 <w:sz w:val="18"/>
               </w:rPr>
-              <w:t>•  Integrated external services via Flurl, with retry and failure handling around calls we did not control.</w:t>
+              <w:t>•  Integrated external banking services via Flurl, with retry and failure handling around calls we did not control.</w:t>
             </w:r>
           </w:p>
           <w:p>
@@ -1056,7 +1056,7 @@
                 <w:color w:val="2D3748"/>
                 <w:sz w:val="17"/>
               </w:rPr>
-              <w:t>Islamic Azad University, Mahshahr</w:t>
+              <w:t>Islamic Azad University</w:t>
               <w:br/>
               <w:t>2013 – 2017</w:t>
             </w:r>

</xml_diff>

<commit_message>
Resumes: LifeBudget and MarketPulse (2026)
</commit_message>
<xml_diff>
--- a/resume_en.docx
+++ b/resume_en.docx
@@ -616,7 +616,7 @@
                 <w:color w:val="1A365D"/>
                 <w:sz w:val="22"/>
               </w:rPr>
-              <w:t>SELECTED PROJECT (AGENTIC CODING)</w:t>
+              <w:t>SELECTED PROJECTS (AGENTIC CODING)</w:t>
             </w:r>
           </w:p>
           <w:p>
@@ -631,7 +631,7 @@
                 <w:color w:val="1A365D"/>
                 <w:sz w:val="21"/>
               </w:rPr>
-              <w:t>LifeBudget: web + Android budgeting app (personal project)</w:t>
+              <w:t>LifeBudget (2026): web + Android budgeting app (personal project)</w:t>
             </w:r>
           </w:p>
           <w:p>
@@ -648,6 +648,37 @@
                 <w:sz w:val="18"/>
               </w:rPr>
               <w:t>•  Logs spending from bank SMS and tracks instalment credit; no foreign dependencies. ASP.NET Core, Kotlin.</w:t>
+            </w:r>
+          </w:p>
+          <w:p>
+            <w:pPr>
+              <w:spacing w:before="160" w:after="40"/>
+              <w:jc w:val="left"/>
+            </w:pPr>
+            <w:r>
+              <w:rPr>
+                <w:rFonts w:ascii="Arial" w:hAnsi="Arial"/>
+                <w:b/>
+                <w:color w:val="1A365D"/>
+                <w:sz w:val="21"/>
+              </w:rPr>
+              <w:t>MarketPulse (2026): dollar and gold price monitor (personal tool)</w:t>
+            </w:r>
+          </w:p>
+          <w:p>
+            <w:pPr>
+              <w:spacing w:after="40"/>
+              <w:ind w:left="200"/>
+              <w:jc w:val="left"/>
+            </w:pPr>
+            <w:r>
+              <w:rPr>
+                <w:rFonts w:ascii="Arial" w:hAnsi="Arial"/>
+                <w:b w:val="0"/>
+                <w:color w:val="2D3748"/>
+                <w:sz w:val="18"/>
+              </w:rPr>
+              <w:t>•  Every 5 minutes computes gold and coin premiums and the cheapest way to hold dollar value; Telegram alerts through a locked-down Cloudflare Worker. .NET 10, SQL Server.</w:t>
             </w:r>
           </w:p>
         </w:tc>

</xml_diff>